<commit_message>
Refactor code structure and remove redundant code blocks for improved readability and maintainability
</commit_message>
<xml_diff>
--- a/CSE357/CV CA Work/Shivang_MockInterview_CV.docx
+++ b/CSE357/CV CA Work/Shivang_MockInterview_CV.docx
@@ -43,48 +43,34 @@
           <w:color w:val="727272"/>
           <w:spacing w:val="-2"/>
         </w:rPr>
-        <w:t>Khagaria</w:t>
+        <w:t>Khagaria,</w:t>
+      </w:r>
+      <w:r>
+        <w:rPr>
+          <w:color w:val="727272"/>
+          <w:spacing w:val="-11"/>
+        </w:rPr>
+        <w:t xml:space="preserve"> </w:t>
       </w:r>
       <w:r>
         <w:rPr>
           <w:color w:val="727272"/>
           <w:spacing w:val="-2"/>
         </w:rPr>
-        <w:t>,</w:t>
+        <w:t>Bihar</w:t>
       </w:r>
       <w:r>
         <w:rPr>
           <w:color w:val="727272"/>
-          <w:spacing w:val="-11"/>
-        </w:rPr>
-        <w:t xml:space="preserve"> </w:t>
+          <w:spacing w:val="-12"/>
+        </w:rPr>
+        <w:t xml:space="preserve"> - 851203 </w:t>
       </w:r>
       <w:r>
         <w:rPr>
           <w:color w:val="727272"/>
           <w:spacing w:val="-2"/>
         </w:rPr>
-        <w:t>Bihar</w:t>
-      </w:r>
-      <w:r>
-        <w:rPr>
-          <w:color w:val="727272"/>
-          <w:spacing w:val="-12"/>
-        </w:rPr>
-        <w:t xml:space="preserve"> - 851203</w:t>
-      </w:r>
-      <w:r>
-        <w:rPr>
-          <w:color w:val="727272"/>
-          <w:spacing w:val="-12"/>
-        </w:rPr>
-        <w:t xml:space="preserve"> </w:t>
-      </w:r>
-      <w:r>
-        <w:rPr>
-          <w:color w:val="727272"/>
-          <w:spacing w:val="-2"/>
-        </w:rPr>
         <w:t>–</w:t>
       </w:r>
       <w:r>
@@ -92,14 +78,7 @@
           <w:color w:val="727272"/>
           <w:spacing w:val="-13"/>
         </w:rPr>
-        <w:t xml:space="preserve"> </w:t>
-      </w:r>
-      <w:r>
-        <w:rPr>
-          <w:color w:val="727272"/>
-          <w:spacing w:val="-13"/>
-        </w:rPr>
-        <w:t>India</w:t>
+        <w:t xml:space="preserve"> India</w:t>
       </w:r>
     </w:p>
     <w:p>
@@ -465,15 +444,7 @@
           <w:i/>
           <w:w w:val="90"/>
         </w:rPr>
-        <w:t>” To</w:t>
-      </w:r>
-      <w:r>
-        <w:rPr>
-          <w:rFonts w:ascii="Arial" w:hAnsi="Arial"/>
-          <w:i/>
-          <w:w w:val="90"/>
-        </w:rPr>
-        <w:t xml:space="preserve"> secure a challenging role as a </w:t>
+        <w:t xml:space="preserve">” To secure a challenging role as a </w:t>
       </w:r>
       <w:r>
         <w:rPr>
@@ -1083,7 +1054,15 @@
           <w:i/>
           <w:spacing w:val="-4"/>
         </w:rPr>
-        <w:t>2026</w:t>
+        <w:t>202</w:t>
+      </w:r>
+      <w:r>
+        <w:rPr>
+          <w:rFonts w:ascii="Arial"/>
+          <w:i/>
+          <w:spacing w:val="-4"/>
+        </w:rPr>
+        <w:t>7</w:t>
       </w:r>
     </w:p>
     <w:p>
@@ -1152,14 +1131,7 @@
           <w:b/>
           <w:spacing w:val="-7"/>
         </w:rPr>
-        <w:t>Naya Raipur</w:t>
-      </w:r>
-      <w:r>
-        <w:rPr>
-          <w:b/>
-          <w:spacing w:val="-7"/>
-        </w:rPr>
-        <w:t xml:space="preserve">, </w:t>
+        <w:t xml:space="preserve">Naya Raipur, </w:t>
       </w:r>
       <w:r>
         <w:rPr>
@@ -1439,14 +1411,7 @@
           <w:b/>
           <w:spacing w:val="-7"/>
         </w:rPr>
-        <w:t xml:space="preserve">, </w:t>
-      </w:r>
-      <w:r>
-        <w:rPr>
-          <w:b/>
-          <w:spacing w:val="-7"/>
-        </w:rPr>
-        <w:t>Chhattisgarh</w:t>
+        <w:t>, Chhattisgarh</w:t>
       </w:r>
     </w:p>
     <w:p>
@@ -1790,10 +1755,7 @@
         <w:t>Backend Development</w:t>
       </w:r>
       <w:r>
-        <w:t xml:space="preserve">: </w:t>
-      </w:r>
-      <w:r>
-        <w:t>Node.js, Express.js, RESTful APIs, JWT Authentication</w:t>
+        <w:t>: Node.js, Express.js, RESTful APIs, JWT Authentication</w:t>
       </w:r>
     </w:p>
     <w:p>
@@ -2430,15 +2392,7 @@
           <w:sz w:val="22"/>
           <w:szCs w:val="22"/>
         </w:rPr>
-        <w:t xml:space="preserve"> – </w:t>
-      </w:r>
-      <w:r>
-        <w:rPr>
-          <w:rFonts w:ascii="Tahoma" w:hAnsi="Tahoma" w:cs="Tahoma"/>
-          <w:sz w:val="22"/>
-          <w:szCs w:val="22"/>
-        </w:rPr>
-        <w:t xml:space="preserve">certified by </w:t>
+        <w:t xml:space="preserve"> – certified by </w:t>
       </w:r>
       <w:r>
         <w:rPr>
@@ -2547,7 +2501,44 @@
           <w:sz w:val="22"/>
           <w:szCs w:val="22"/>
         </w:rPr>
-        <w:t>SDC</w:t>
+        <w:t>SDC-LPU</w:t>
+      </w:r>
+      <w:r>
+        <w:rPr>
+          <w:rFonts w:ascii="Tahoma" w:hAnsi="Tahoma" w:cs="Tahoma"/>
+          <w:sz w:val="22"/>
+          <w:szCs w:val="22"/>
+        </w:rPr>
+        <w:t xml:space="preserve"> (2025)</w:t>
+      </w:r>
+    </w:p>
+    <w:p>
+      <w:pPr>
+        <w:pStyle w:val="NormalWeb"/>
+        <w:spacing w:before="0" w:beforeAutospacing="0" w:after="0" w:afterAutospacing="0"/>
+        <w:rPr>
+          <w:rFonts w:ascii="Tahoma" w:hAnsi="Tahoma" w:cs="Tahoma"/>
+          <w:sz w:val="22"/>
+          <w:szCs w:val="22"/>
+        </w:rPr>
+      </w:pPr>
+      <w:r>
+        <w:rPr>
+          <w:rFonts w:ascii="Tahoma" w:hAnsi="Tahoma" w:cs="Tahoma"/>
+          <w:b/>
+          <w:bCs/>
+          <w:sz w:val="22"/>
+          <w:szCs w:val="22"/>
+        </w:rPr>
+        <w:t xml:space="preserve">MongoDB Schema Design Optimization – </w:t>
+      </w:r>
+      <w:r>
+        <w:rPr>
+          <w:rFonts w:ascii="Tahoma" w:hAnsi="Tahoma" w:cs="Tahoma"/>
+          <w:sz w:val="22"/>
+          <w:szCs w:val="22"/>
+        </w:rPr>
+        <w:t xml:space="preserve">certified by </w:t>
       </w:r>
       <w:r>
         <w:rPr>
@@ -2558,7 +2549,44 @@
           <w:sz w:val="22"/>
           <w:szCs w:val="22"/>
         </w:rPr>
-        <w:t>-</w:t>
+        <w:t>MongoDB University</w:t>
+      </w:r>
+      <w:r>
+        <w:rPr>
+          <w:rFonts w:ascii="Tahoma" w:hAnsi="Tahoma" w:cs="Tahoma"/>
+          <w:sz w:val="22"/>
+          <w:szCs w:val="22"/>
+        </w:rPr>
+        <w:t xml:space="preserve"> (2025)</w:t>
+      </w:r>
+    </w:p>
+    <w:p>
+      <w:pPr>
+        <w:pStyle w:val="NormalWeb"/>
+        <w:spacing w:before="0" w:beforeAutospacing="0" w:after="0" w:afterAutospacing="0"/>
+        <w:rPr>
+          <w:rFonts w:ascii="Tahoma" w:hAnsi="Tahoma" w:cs="Tahoma"/>
+          <w:sz w:val="22"/>
+          <w:szCs w:val="22"/>
+        </w:rPr>
+      </w:pPr>
+      <w:r>
+        <w:rPr>
+          <w:rFonts w:ascii="Tahoma" w:hAnsi="Tahoma" w:cs="Tahoma"/>
+          <w:b/>
+          <w:bCs/>
+          <w:sz w:val="22"/>
+          <w:szCs w:val="22"/>
+        </w:rPr>
+        <w:t xml:space="preserve">Fundamentals of Network Communication – </w:t>
+      </w:r>
+      <w:r>
+        <w:rPr>
+          <w:rFonts w:ascii="Tahoma" w:hAnsi="Tahoma" w:cs="Tahoma"/>
+          <w:sz w:val="22"/>
+          <w:szCs w:val="22"/>
+        </w:rPr>
+        <w:t xml:space="preserve">certified by </w:t>
       </w:r>
       <w:r>
         <w:rPr>
@@ -2569,15 +2597,15 @@
           <w:sz w:val="22"/>
           <w:szCs w:val="22"/>
         </w:rPr>
-        <w:t>LPU</w:t>
-      </w:r>
-      <w:r>
-        <w:rPr>
-          <w:rFonts w:ascii="Tahoma" w:hAnsi="Tahoma" w:cs="Tahoma"/>
-          <w:sz w:val="22"/>
-          <w:szCs w:val="22"/>
-        </w:rPr>
-        <w:t xml:space="preserve"> (2025)</w:t>
+        <w:t>Coursera</w:t>
+      </w:r>
+      <w:r>
+        <w:rPr>
+          <w:rFonts w:ascii="Tahoma" w:hAnsi="Tahoma" w:cs="Tahoma"/>
+          <w:sz w:val="22"/>
+          <w:szCs w:val="22"/>
+        </w:rPr>
+        <w:t xml:space="preserve"> (2024)</w:t>
       </w:r>
     </w:p>
     <w:p>
@@ -2598,113 +2626,7 @@
           <w:sz w:val="22"/>
           <w:szCs w:val="22"/>
         </w:rPr>
-        <w:t xml:space="preserve">MongoDB Schema Design Optimization – </w:t>
-      </w:r>
-      <w:r>
-        <w:rPr>
-          <w:rFonts w:ascii="Tahoma" w:hAnsi="Tahoma" w:cs="Tahoma"/>
-          <w:sz w:val="22"/>
-          <w:szCs w:val="22"/>
-        </w:rPr>
-        <w:t xml:space="preserve">certified by </w:t>
-      </w:r>
-      <w:r>
-        <w:rPr>
-          <w:rStyle w:val="Strong"/>
-          <w:rFonts w:ascii="Tahoma" w:hAnsi="Tahoma" w:cs="Tahoma"/>
-          <w:b w:val="0"/>
-          <w:bCs w:val="0"/>
-          <w:sz w:val="22"/>
-          <w:szCs w:val="22"/>
-        </w:rPr>
-        <w:t>MongoDB University</w:t>
-      </w:r>
-      <w:r>
-        <w:rPr>
-          <w:rFonts w:ascii="Tahoma" w:hAnsi="Tahoma" w:cs="Tahoma"/>
-          <w:sz w:val="22"/>
-          <w:szCs w:val="22"/>
-        </w:rPr>
-        <w:t xml:space="preserve"> (2025)</w:t>
-      </w:r>
-    </w:p>
-    <w:p>
-      <w:pPr>
-        <w:pStyle w:val="NormalWeb"/>
-        <w:spacing w:before="0" w:beforeAutospacing="0" w:after="0" w:afterAutospacing="0"/>
-        <w:rPr>
-          <w:rFonts w:ascii="Tahoma" w:hAnsi="Tahoma" w:cs="Tahoma"/>
-          <w:sz w:val="22"/>
-          <w:szCs w:val="22"/>
-        </w:rPr>
-      </w:pPr>
-      <w:r>
-        <w:rPr>
-          <w:rFonts w:ascii="Tahoma" w:hAnsi="Tahoma" w:cs="Tahoma"/>
-          <w:b/>
-          <w:bCs/>
-          <w:sz w:val="22"/>
-          <w:szCs w:val="22"/>
-        </w:rPr>
-        <w:t xml:space="preserve">Fundamentals of Network Communication – </w:t>
-      </w:r>
-      <w:r>
-        <w:rPr>
-          <w:rFonts w:ascii="Tahoma" w:hAnsi="Tahoma" w:cs="Tahoma"/>
-          <w:sz w:val="22"/>
-          <w:szCs w:val="22"/>
-        </w:rPr>
-        <w:t xml:space="preserve">certified by </w:t>
-      </w:r>
-      <w:r>
-        <w:rPr>
-          <w:rStyle w:val="Strong"/>
-          <w:rFonts w:ascii="Tahoma" w:hAnsi="Tahoma" w:cs="Tahoma"/>
-          <w:b w:val="0"/>
-          <w:bCs w:val="0"/>
-          <w:sz w:val="22"/>
-          <w:szCs w:val="22"/>
-        </w:rPr>
-        <w:t>Coursera</w:t>
-      </w:r>
-      <w:r>
-        <w:rPr>
-          <w:rFonts w:ascii="Tahoma" w:hAnsi="Tahoma" w:cs="Tahoma"/>
-          <w:sz w:val="22"/>
-          <w:szCs w:val="22"/>
-        </w:rPr>
-        <w:t xml:space="preserve"> (2024)</w:t>
-      </w:r>
-    </w:p>
-    <w:p>
-      <w:pPr>
-        <w:pStyle w:val="NormalWeb"/>
-        <w:spacing w:before="0" w:beforeAutospacing="0" w:after="0" w:afterAutospacing="0"/>
-        <w:rPr>
-          <w:rFonts w:ascii="Tahoma" w:hAnsi="Tahoma" w:cs="Tahoma"/>
-          <w:sz w:val="22"/>
-          <w:szCs w:val="22"/>
-        </w:rPr>
-      </w:pPr>
-      <w:r>
-        <w:rPr>
-          <w:rFonts w:ascii="Tahoma" w:hAnsi="Tahoma" w:cs="Tahoma"/>
-          <w:b/>
-          <w:bCs/>
-          <w:sz w:val="22"/>
-          <w:szCs w:val="22"/>
-        </w:rPr>
-        <w:t>Peer-to-Peer Protocols and Local Area Networks –</w:t>
-      </w:r>
-      <w:r>
-        <w:rPr>
-          <w:rFonts w:ascii="Tahoma" w:hAnsi="Tahoma" w:cs="Tahoma"/>
-          <w:b/>
-          <w:bCs/>
-          <w:sz w:val="22"/>
-          <w:szCs w:val="22"/>
-        </w:rPr>
-        <w:t xml:space="preserve"> </w:t>
+        <w:t xml:space="preserve">Peer-to-Peer Protocols and Local Area Networks – </w:t>
       </w:r>
       <w:r>
         <w:rPr>
@@ -3339,10 +3261,10 @@
               </w:rPr>
             </w:pPr>
             <w:r>
-              <w:t>Complete certification in</w:t>
-            </w:r>
-            <w:r>
-              <w:t xml:space="preserve"> [Certificate Name]</w:t>
+              <w:rPr>
+                <w:lang w:val="en-ID"/>
+              </w:rPr>
+              <w:t>Solve 100 additional DSA problems on LeetCode and GeeksforGeeks.</w:t>
             </w:r>
           </w:p>
           <w:p>
@@ -3361,7 +3283,7 @@
               <w:rPr>
                 <w:lang w:val="en-ID"/>
               </w:rPr>
-              <w:t>Enroll in and complete [Specific Mooc or Course]</w:t>
+              <w:t>Learn and implement Docker containerization for backend applications.</w:t>
             </w:r>
           </w:p>
           <w:p>
@@ -3380,31 +3302,13 @@
               <w:rPr>
                 <w:lang w:val="en-ID"/>
               </w:rPr>
-              <w:t xml:space="preserve">Finish the project titled </w:t>
+              <w:t>Build a URL Shortener Backend System using Node.js, Express, MongoDB, and Redis</w:t>
             </w:r>
             <w:r>
               <w:rPr>
                 <w:lang w:val="en-ID"/>
               </w:rPr>
-              <w:t>“</w:t>
-            </w:r>
-            <w:r>
-              <w:rPr>
-                <w:lang w:val="en-ID"/>
-              </w:rPr>
-              <w:t>[Project Name]</w:t>
-            </w:r>
-            <w:r>
-              <w:rPr>
-                <w:lang w:val="en-ID"/>
-              </w:rPr>
-              <w:t xml:space="preserve">” </w:t>
-            </w:r>
-            <w:r>
-              <w:rPr>
-                <w:lang w:val="en-ID"/>
-              </w:rPr>
-              <w:t>to strengthen your CV.</w:t>
+              <w:t>.</w:t>
             </w:r>
           </w:p>
         </w:tc>
@@ -3445,19 +3349,7 @@
           <w:szCs w:val="28"/>
           <w:u w:val="single" w:color="3872B2"/>
         </w:rPr>
-        <w:t xml:space="preserve">Signatures                                                                      </w:t>
-      </w:r>
-      <w:r>
-        <w:rPr>
-          <w:b/>
-          <w:bCs/>
-          <w:color w:val="3872B2"/>
-          <w:spacing w:val="-2"/>
-          <w:sz w:val="28"/>
-          <w:szCs w:val="28"/>
-          <w:u w:val="single" w:color="3872B2"/>
-        </w:rPr>
-        <w:t xml:space="preserve">                                       </w:t>
+        <w:t xml:space="preserve">Signatures                                                                                                             </w:t>
       </w:r>
     </w:p>
     <w:p>
@@ -3515,60 +3407,6 @@
           <w:lang w:val="en-ID"/>
         </w:rPr>
         <w:t>_______________________________</w:t>
-      </w:r>
-    </w:p>
-    <w:p>
-      <w:pPr>
-        <w:pStyle w:val="BodyText"/>
-        <w:spacing w:before="60" w:line="244" w:lineRule="auto"/>
-        <w:ind w:left="37" w:firstLine="5"/>
-        <w:rPr>
-          <w:lang w:val="en-ID"/>
-        </w:rPr>
-      </w:pPr>
-      <w:r>
-        <w:rPr>
-          <w:lang w:val="en-ID"/>
-        </w:rPr>
-        <w:tab/>
-        <w:t xml:space="preserve">      Student’s Full Name</w:t>
-      </w:r>
-      <w:r>
-        <w:rPr>
-          <w:lang w:val="en-ID"/>
-        </w:rPr>
-        <w:tab/>
-      </w:r>
-      <w:r>
-        <w:rPr>
-          <w:lang w:val="en-ID"/>
-        </w:rPr>
-        <w:tab/>
-      </w:r>
-      <w:r>
-        <w:rPr>
-          <w:lang w:val="en-ID"/>
-        </w:rPr>
-        <w:tab/>
-      </w:r>
-      <w:r>
-        <w:rPr>
-          <w:lang w:val="en-ID"/>
-        </w:rPr>
-        <w:tab/>
-      </w:r>
-      <w:r>
-        <w:rPr>
-          <w:lang w:val="en-ID"/>
-        </w:rPr>
-        <w:tab/>
-      </w:r>
-      <w:r>
-        <w:rPr>
-          <w:lang w:val="en-ID"/>
-        </w:rPr>
-        <w:tab/>
-        <w:t>Instructor’s Full Name</w:t>
       </w:r>
     </w:p>
     <w:p>
@@ -4669,6 +4507,7 @@
   <w:style w:type="character" w:default="1" w:styleId="DefaultParagraphFont">
     <w:name w:val="Default Paragraph Font"/>
     <w:uiPriority w:val="1"/>
+    <w:semiHidden/>
     <w:unhideWhenUsed/>
   </w:style>
   <w:style w:type="table" w:default="1" w:styleId="TableNormal">

</xml_diff>